<commit_message>
CMS I Exam 4 cram sheet: Coronary Artery Disease rows
Three topics / 20 rows before Heart Failure (anatomy, pain and workup;
troponin, angina and the electrocardiogram; STEMI care, stents and variant
angina). Sheet: 145 rows / 20 topics; sub line now covers the whole block.

Co-Authored-By: Claude Opus 5.5 (1M context) <noreply@anthropic.com>
</commit_message>
<xml_diff>
--- a/Clinical Medicine and Surgery I Exam 4/cms-exam-4-cram-sheet.docx
+++ b/Clinical Medicine and Surgery I Exam 4/cms-exam-4-cram-sheet.docx
@@ -62,7 +62,7 @@
           <w:b w:val="0"/>
           <w:i w:val="0"/>
         </w:rPr>
-        <w:t>Hypertension, hypotension, atherosclerosis and lipid disorders, valvular heart disease and heart failure condensed: classification and causes, the orthostatic heart-rate tell, the lipid memory aid and 2018 statin decisions, the murmur words and valve-by-valve essentials, and the 2022 heart failure groups, stages and therapy. Coronary artery disease follows when posted.</w:t>
+        <w:t>The whole Exam 4 block condensed — hypertension, hypotension, atherosclerosis and lipid disorders, valvular heart disease, coronary artery disease and heart failure: classification and causes, the orthostatic heart-rate tell, the lipid memory aid and 2018 statin decisions, the murmur words and valve-by-valve essentials, the troponin numbers and lead-to-artery chart, and the 2022 heart failure groups, stages and therapy.</w:t>
       </w:r>
     </w:p>
     <w:tbl>
@@ -10049,6 +10049,1896 @@
                 <w:sz w:val="18"/>
               </w:rPr>
               <w:t>Pig or cow tissue → no anticoagulation beyond the immediate postoperative period; preferred when anticoagulation is contraindicated. (Valve type by age on slide 74 is unsettled — not learned.)</w:t>
+            </w:r>
+          </w:p>
+        </w:tc>
+      </w:tr>
+    </w:tbl>
+    <w:p>
+      <w:pPr>
+        <w:spacing w:after="80"/>
+      </w:pPr>
+    </w:p>
+    <w:p>
+      <w:pPr>
+        <w:pStyle w:val="Heading1"/>
+        <w:spacing w:before="280" w:after="100"/>
+      </w:pPr>
+      <w:r>
+        <w:rPr>
+          <w:rFonts w:ascii="Georgia" w:hAnsi="Georgia"/>
+          <w:color w:val="17494B"/>
+        </w:rPr>
+        <w:t>CAD: Anatomy, Pain &amp; Workup</w:t>
+      </w:r>
+    </w:p>
+    <w:tbl>
+      <w:tblPr>
+        <w:tblStyle w:val="TableGrid"/>
+        <w:tblW w:type="auto" w:w="0"/>
+        <w:jc w:val="center"/>
+        <w:tblLook w:firstColumn="1" w:firstRow="1" w:lastColumn="0" w:lastRow="0" w:noHBand="0" w:noVBand="1" w:val="04A0"/>
+        <w:tblBorders>
+          <w:top w:val="single" w:sz="4" w:space="0" w:color="D8D2D4"/>
+          <w:left w:val="single" w:sz="4" w:space="0" w:color="D8D2D4"/>
+          <w:bottom w:val="single" w:sz="4" w:space="0" w:color="D8D2D4"/>
+          <w:right w:val="single" w:sz="4" w:space="0" w:color="D8D2D4"/>
+          <w:insideH w:val="single" w:sz="4" w:space="0" w:color="D8D2D4"/>
+          <w:insideV w:val="single" w:sz="4" w:space="0" w:color="D8D2D4"/>
+        </w:tblBorders>
+      </w:tblPr>
+      <w:tblGrid>
+        <w:gridCol w:w="5112"/>
+        <w:gridCol w:w="5112"/>
+      </w:tblGrid>
+      <w:tr>
+        <w:tc>
+          <w:tcPr>
+            <w:tcW w:type="dxa" w:w="5112"/>
+            <w:shd w:val="clear" w:color="auto" w:fill="17494B"/>
+          </w:tcPr>
+          <w:p>
+            <w:pPr>
+              <w:spacing w:after="40"/>
+            </w:pPr>
+            <w:r>
+              <w:rPr>
+                <w:b/>
+                <w:color w:val="FFFFFF"/>
+                <w:sz w:val="18"/>
+              </w:rPr>
+            </w:r>
+            <w:r>
+              <w:rPr>
+                <w:b/>
+                <w:i w:val="0"/>
+                <w:color w:val="FFFFFF"/>
+                <w:sz w:val="18"/>
+              </w:rPr>
+              <w:t>Term</w:t>
+            </w:r>
+          </w:p>
+        </w:tc>
+        <w:tc>
+          <w:tcPr>
+            <w:tcW w:type="dxa" w:w="5112"/>
+            <w:shd w:val="clear" w:color="auto" w:fill="17494B"/>
+          </w:tcPr>
+          <w:p>
+            <w:pPr>
+              <w:spacing w:after="40"/>
+            </w:pPr>
+            <w:r>
+              <w:rPr>
+                <w:b/>
+                <w:color w:val="FFFFFF"/>
+                <w:sz w:val="18"/>
+              </w:rPr>
+            </w:r>
+            <w:r>
+              <w:rPr>
+                <w:b/>
+                <w:i w:val="0"/>
+                <w:color w:val="FFFFFF"/>
+                <w:sz w:val="18"/>
+              </w:rPr>
+              <w:t>What you need to know</w:t>
+            </w:r>
+          </w:p>
+        </w:tc>
+      </w:tr>
+      <w:tr>
+        <w:tc>
+          <w:tcPr>
+            <w:tcW w:type="dxa" w:w="5112"/>
+            <w:shd w:val="clear" w:color="auto" w:fill="F1EEEF"/>
+          </w:tcPr>
+          <w:p>
+            <w:pPr>
+              <w:spacing w:after="40"/>
+            </w:pPr>
+            <w:r>
+              <w:rPr>
+                <w:b/>
+                <w:sz w:val="18"/>
+              </w:rPr>
+            </w:r>
+            <w:r>
+              <w:rPr>
+                <w:b/>
+                <w:i w:val="0"/>
+                <w:sz w:val="18"/>
+              </w:rPr>
+              <w:t>Ischemia</w:t>
+            </w:r>
+          </w:p>
+        </w:tc>
+        <w:tc>
+          <w:tcPr>
+            <w:tcW w:type="dxa" w:w="5112"/>
+          </w:tcPr>
+          <w:p>
+            <w:pPr>
+              <w:spacing w:after="40"/>
+            </w:pPr>
+            <w:r>
+              <w:rPr>
+                <w:sz w:val="18"/>
+              </w:rPr>
+            </w:r>
+            <w:r>
+              <w:rPr>
+                <w:b w:val="0"/>
+                <w:i w:val="0"/>
+                <w:sz w:val="18"/>
+              </w:rPr>
+              <w:t xml:space="preserve">Oxygen </w:t>
+            </w:r>
+            <w:r>
+              <w:rPr>
+                <w:b/>
+                <w:i w:val="0"/>
+                <w:sz w:val="18"/>
+              </w:rPr>
+              <w:t>demand vs supply</w:t>
+            </w:r>
+            <w:r>
+              <w:rPr>
+                <w:b w:val="0"/>
+                <w:i w:val="0"/>
+                <w:sz w:val="18"/>
+              </w:rPr>
+              <w:t xml:space="preserve"> mismatch. Heart = 0.3% of body weight, 7% of oxygen use. </w:t>
+            </w:r>
+            <w:r>
+              <w:rPr>
+                <w:b/>
+                <w:i w:val="0"/>
+                <w:sz w:val="18"/>
+              </w:rPr>
+              <w:t>Irreversible injury in 40–60 minutes.</w:t>
+            </w:r>
+            <w:r>
+              <w:rPr>
+                <w:b w:val="0"/>
+                <w:i w:val="0"/>
+                <w:sz w:val="18"/>
+              </w:rPr>
+              <w:t xml:space="preserve"> Wall motion on echo: hypokinesia (reduced), akinesia (none), dyskinesia (bulging).</w:t>
+            </w:r>
+          </w:p>
+        </w:tc>
+      </w:tr>
+      <w:tr>
+        <w:tc>
+          <w:tcPr>
+            <w:tcW w:type="dxa" w:w="5112"/>
+            <w:shd w:val="clear" w:color="auto" w:fill="F1EEEF"/>
+          </w:tcPr>
+          <w:p>
+            <w:pPr>
+              <w:spacing w:after="40"/>
+            </w:pPr>
+            <w:r>
+              <w:rPr>
+                <w:b/>
+                <w:sz w:val="18"/>
+              </w:rPr>
+            </w:r>
+            <w:r>
+              <w:rPr>
+                <w:b/>
+                <w:i w:val="0"/>
+                <w:sz w:val="18"/>
+              </w:rPr>
+              <w:t>★ Arteries</w:t>
+            </w:r>
+          </w:p>
+        </w:tc>
+        <w:tc>
+          <w:tcPr>
+            <w:tcW w:type="dxa" w:w="5112"/>
+          </w:tcPr>
+          <w:p>
+            <w:pPr>
+              <w:spacing w:after="40"/>
+            </w:pPr>
+            <w:r>
+              <w:rPr>
+                <w:sz w:val="18"/>
+              </w:rPr>
+            </w:r>
+            <w:r>
+              <w:rPr>
+                <w:b w:val="0"/>
+                <w:i w:val="0"/>
+                <w:sz w:val="18"/>
+              </w:rPr>
+              <w:t xml:space="preserve">Three main: right coronary, left anterior descending, circumflex. </w:t>
+            </w:r>
+            <w:r>
+              <w:rPr>
+                <w:b/>
+                <w:i w:val="0"/>
+                <w:sz w:val="18"/>
+              </w:rPr>
+              <w:t>Right coronary supplies the atrioventricular node</w:t>
+            </w:r>
+            <w:r>
+              <w:rPr>
+                <w:b w:val="0"/>
+                <w:i w:val="0"/>
+                <w:sz w:val="18"/>
+              </w:rPr>
+              <w:t xml:space="preserve"> → complete heart block. </w:t>
+            </w:r>
+            <w:r>
+              <w:rPr>
+                <w:b/>
+                <w:i w:val="0"/>
+                <w:sz w:val="18"/>
+              </w:rPr>
+              <w:t>Anterior interventricular artery = LAD (left anterior descending)</w:t>
+            </w:r>
+            <w:r>
+              <w:rPr>
+                <w:b w:val="0"/>
+                <w:i w:val="0"/>
+                <w:sz w:val="18"/>
+              </w:rPr>
+              <w:t>, the most common culprit (40–50%), then right coronary (30–40%), circumflex (15–20%).</w:t>
+            </w:r>
+          </w:p>
+        </w:tc>
+      </w:tr>
+      <w:tr>
+        <w:tc>
+          <w:tcPr>
+            <w:tcW w:type="dxa" w:w="5112"/>
+            <w:shd w:val="clear" w:color="auto" w:fill="F1EEEF"/>
+          </w:tcPr>
+          <w:p>
+            <w:pPr>
+              <w:spacing w:after="40"/>
+            </w:pPr>
+            <w:r>
+              <w:rPr>
+                <w:b/>
+                <w:sz w:val="18"/>
+              </w:rPr>
+            </w:r>
+            <w:r>
+              <w:rPr>
+                <w:b/>
+                <w:i w:val="0"/>
+                <w:sz w:val="18"/>
+              </w:rPr>
+              <w:t>Risk factors</w:t>
+            </w:r>
+          </w:p>
+        </w:tc>
+        <w:tc>
+          <w:tcPr>
+            <w:tcW w:type="dxa" w:w="5112"/>
+          </w:tcPr>
+          <w:p>
+            <w:pPr>
+              <w:spacing w:after="40"/>
+            </w:pPr>
+            <w:r>
+              <w:rPr>
+                <w:sz w:val="18"/>
+              </w:rPr>
+            </w:r>
+            <w:r>
+              <w:rPr>
+                <w:b w:val="0"/>
+                <w:i w:val="0"/>
+                <w:sz w:val="18"/>
+              </w:rPr>
+              <w:t xml:space="preserve">Men ≥45, women ≥55; family history male &lt;55 / female &lt;65. Smoking = strong predictor in </w:t>
+            </w:r>
+            <w:r>
+              <w:rPr>
+                <w:b/>
+                <w:i w:val="0"/>
+                <w:sz w:val="18"/>
+              </w:rPr>
+              <w:t>women &lt;45</w:t>
+            </w:r>
+            <w:r>
+              <w:rPr>
+                <w:b w:val="0"/>
+                <w:i w:val="0"/>
+                <w:sz w:val="18"/>
+              </w:rPr>
+              <w:t>. Plaque rupture → platelets + tissue factor → clotting cascade → fibrin.</w:t>
+            </w:r>
+          </w:p>
+        </w:tc>
+      </w:tr>
+      <w:tr>
+        <w:tc>
+          <w:tcPr>
+            <w:tcW w:type="dxa" w:w="5112"/>
+            <w:shd w:val="clear" w:color="auto" w:fill="F1EEEF"/>
+          </w:tcPr>
+          <w:p>
+            <w:pPr>
+              <w:spacing w:after="40"/>
+            </w:pPr>
+            <w:r>
+              <w:rPr>
+                <w:b/>
+                <w:sz w:val="18"/>
+              </w:rPr>
+            </w:r>
+            <w:r>
+              <w:rPr>
+                <w:b/>
+                <w:i w:val="0"/>
+                <w:sz w:val="18"/>
+              </w:rPr>
+              <w:t>★ The pain</w:t>
+            </w:r>
+          </w:p>
+        </w:tc>
+        <w:tc>
+          <w:tcPr>
+            <w:tcW w:type="dxa" w:w="5112"/>
+          </w:tcPr>
+          <w:p>
+            <w:pPr>
+              <w:spacing w:after="40"/>
+            </w:pPr>
+            <w:r>
+              <w:rPr>
+                <w:sz w:val="18"/>
+              </w:rPr>
+            </w:r>
+            <w:r>
+              <w:rPr>
+                <w:b w:val="0"/>
+                <w:i w:val="0"/>
+                <w:sz w:val="18"/>
+              </w:rPr>
+              <w:t xml:space="preserve">Substernal pressure, worse with exertion, </w:t>
+            </w:r>
+            <w:r>
+              <w:rPr>
+                <w:b/>
+                <w:i w:val="0"/>
+                <w:sz w:val="18"/>
+              </w:rPr>
+              <w:t>not positional</w:t>
+            </w:r>
+            <w:r>
+              <w:rPr>
+                <w:b w:val="0"/>
+                <w:i w:val="0"/>
+                <w:sz w:val="18"/>
+              </w:rPr>
+              <w:t xml:space="preserve">, relieved by nitroglycerin; Levine's sign = clenched fist over the sternum. </w:t>
+            </w:r>
+            <w:r>
+              <w:rPr>
+                <w:b/>
+                <w:i w:val="0"/>
+                <w:sz w:val="18"/>
+              </w:rPr>
+              <w:t>Silent ischemia</w:t>
+            </w:r>
+            <w:r>
+              <w:rPr>
+                <w:b w:val="0"/>
+                <w:i w:val="0"/>
+                <w:sz w:val="18"/>
+              </w:rPr>
+              <w:t xml:space="preserve"> in diabetes, neuropathy, transplanted heart → dyspnea, nausea, fatigue. Referred: jaw, tooth, arm.</w:t>
+            </w:r>
+          </w:p>
+        </w:tc>
+      </w:tr>
+      <w:tr>
+        <w:tc>
+          <w:tcPr>
+            <w:tcW w:type="dxa" w:w="5112"/>
+            <w:shd w:val="clear" w:color="auto" w:fill="F1EEEF"/>
+          </w:tcPr>
+          <w:p>
+            <w:pPr>
+              <w:spacing w:after="40"/>
+            </w:pPr>
+            <w:r>
+              <w:rPr>
+                <w:b/>
+                <w:sz w:val="18"/>
+              </w:rPr>
+            </w:r>
+            <w:r>
+              <w:rPr>
+                <w:b/>
+                <w:i w:val="0"/>
+                <w:sz w:val="18"/>
+              </w:rPr>
+              <w:t>Workup</w:t>
+            </w:r>
+          </w:p>
+        </w:tc>
+        <w:tc>
+          <w:tcPr>
+            <w:tcW w:type="dxa" w:w="5112"/>
+          </w:tcPr>
+          <w:p>
+            <w:pPr>
+              <w:spacing w:after="40"/>
+            </w:pPr>
+            <w:r>
+              <w:rPr>
+                <w:sz w:val="18"/>
+              </w:rPr>
+            </w:r>
+            <w:r>
+              <w:rPr>
+                <w:b w:val="0"/>
+                <w:i w:val="0"/>
+                <w:sz w:val="18"/>
+              </w:rPr>
+              <w:t xml:space="preserve">Every chest pain: </w:t>
+            </w:r>
+            <w:r>
+              <w:rPr>
+                <w:b/>
+                <w:i w:val="0"/>
+                <w:sz w:val="18"/>
+              </w:rPr>
+              <w:t>chest radiograph + STAT electrocardiogram</w:t>
+            </w:r>
+            <w:r>
+              <w:rPr>
+                <w:b w:val="0"/>
+                <w:i w:val="0"/>
+                <w:sz w:val="18"/>
+              </w:rPr>
+              <w:t xml:space="preserve">. Calcium score = </w:t>
+            </w:r>
+            <w:r>
+              <w:rPr>
+                <w:b/>
+                <w:i w:val="0"/>
+                <w:sz w:val="18"/>
+              </w:rPr>
+              <w:t>risk stratification, not acute coronary syndrome</w:t>
+            </w:r>
+            <w:r>
+              <w:rPr>
+                <w:b w:val="0"/>
+                <w:i w:val="0"/>
+                <w:sz w:val="18"/>
+              </w:rPr>
+              <w:t>. Abnormal nuclear stress test ⇒ cardiac catheterization.</w:t>
+            </w:r>
+          </w:p>
+        </w:tc>
+      </w:tr>
+      <w:tr>
+        <w:tc>
+          <w:tcPr>
+            <w:tcW w:type="dxa" w:w="5112"/>
+            <w:shd w:val="clear" w:color="auto" w:fill="F1EEEF"/>
+          </w:tcPr>
+          <w:p>
+            <w:pPr>
+              <w:spacing w:after="40"/>
+            </w:pPr>
+            <w:r>
+              <w:rPr>
+                <w:b/>
+                <w:sz w:val="18"/>
+              </w:rPr>
+            </w:r>
+            <w:r>
+              <w:rPr>
+                <w:b/>
+                <w:i w:val="0"/>
+                <w:sz w:val="18"/>
+              </w:rPr>
+              <w:t>★ Risk scores</w:t>
+            </w:r>
+          </w:p>
+        </w:tc>
+        <w:tc>
+          <w:tcPr>
+            <w:tcW w:type="dxa" w:w="5112"/>
+          </w:tcPr>
+          <w:p>
+            <w:pPr>
+              <w:spacing w:after="40"/>
+            </w:pPr>
+            <w:r>
+              <w:rPr>
+                <w:sz w:val="18"/>
+              </w:rPr>
+            </w:r>
+            <w:r>
+              <w:rPr>
+                <w:b w:val="0"/>
+                <w:i w:val="0"/>
+                <w:sz w:val="18"/>
+              </w:rPr>
+              <w:t xml:space="preserve">HEART = History, EKG (electrocardiogram), Age, Risk factors, Troponin (parts only). </w:t>
+            </w:r>
+            <w:r>
+              <w:rPr>
+                <w:b/>
+                <w:i w:val="0"/>
+                <w:sz w:val="18"/>
+              </w:rPr>
+              <w:t>TIMI (Thrombolysis in Myocardial Infarction) 3 or higher → early invasive approach</w:t>
+            </w:r>
+            <w:r>
+              <w:rPr>
+                <w:b w:val="0"/>
+                <w:i w:val="0"/>
+                <w:sz w:val="18"/>
+              </w:rPr>
+              <w:t xml:space="preserve"> — the only score cut-off tested.</w:t>
+            </w:r>
+          </w:p>
+        </w:tc>
+      </w:tr>
+    </w:tbl>
+    <w:p>
+      <w:pPr>
+        <w:spacing w:after="80"/>
+      </w:pPr>
+    </w:p>
+    <w:p>
+      <w:pPr>
+        <w:pStyle w:val="Heading1"/>
+        <w:spacing w:before="280" w:after="100"/>
+      </w:pPr>
+      <w:r>
+        <w:rPr>
+          <w:rFonts w:ascii="Georgia" w:hAnsi="Georgia"/>
+          <w:color w:val="17494B"/>
+        </w:rPr>
+        <w:t>CAD: Troponin, Angina &amp; the ECG</w:t>
+      </w:r>
+    </w:p>
+    <w:tbl>
+      <w:tblPr>
+        <w:tblStyle w:val="TableGrid"/>
+        <w:tblW w:type="auto" w:w="0"/>
+        <w:jc w:val="center"/>
+        <w:tblLook w:firstColumn="1" w:firstRow="1" w:lastColumn="0" w:lastRow="0" w:noHBand="0" w:noVBand="1" w:val="04A0"/>
+        <w:tblBorders>
+          <w:top w:val="single" w:sz="4" w:space="0" w:color="D8D2D4"/>
+          <w:left w:val="single" w:sz="4" w:space="0" w:color="D8D2D4"/>
+          <w:bottom w:val="single" w:sz="4" w:space="0" w:color="D8D2D4"/>
+          <w:right w:val="single" w:sz="4" w:space="0" w:color="D8D2D4"/>
+          <w:insideH w:val="single" w:sz="4" w:space="0" w:color="D8D2D4"/>
+          <w:insideV w:val="single" w:sz="4" w:space="0" w:color="D8D2D4"/>
+        </w:tblBorders>
+      </w:tblPr>
+      <w:tblGrid>
+        <w:gridCol w:w="5112"/>
+        <w:gridCol w:w="5112"/>
+      </w:tblGrid>
+      <w:tr>
+        <w:tc>
+          <w:tcPr>
+            <w:tcW w:type="dxa" w:w="5112"/>
+            <w:shd w:val="clear" w:color="auto" w:fill="17494B"/>
+          </w:tcPr>
+          <w:p>
+            <w:pPr>
+              <w:spacing w:after="40"/>
+            </w:pPr>
+            <w:r>
+              <w:rPr>
+                <w:b/>
+                <w:color w:val="FFFFFF"/>
+                <w:sz w:val="18"/>
+              </w:rPr>
+            </w:r>
+            <w:r>
+              <w:rPr>
+                <w:b/>
+                <w:i w:val="0"/>
+                <w:color w:val="FFFFFF"/>
+                <w:sz w:val="18"/>
+              </w:rPr>
+              <w:t>Term</w:t>
+            </w:r>
+          </w:p>
+        </w:tc>
+        <w:tc>
+          <w:tcPr>
+            <w:tcW w:type="dxa" w:w="5112"/>
+            <w:shd w:val="clear" w:color="auto" w:fill="17494B"/>
+          </w:tcPr>
+          <w:p>
+            <w:pPr>
+              <w:spacing w:after="40"/>
+            </w:pPr>
+            <w:r>
+              <w:rPr>
+                <w:b/>
+                <w:color w:val="FFFFFF"/>
+                <w:sz w:val="18"/>
+              </w:rPr>
+            </w:r>
+            <w:r>
+              <w:rPr>
+                <w:b/>
+                <w:i w:val="0"/>
+                <w:color w:val="FFFFFF"/>
+                <w:sz w:val="18"/>
+              </w:rPr>
+              <w:t>What you need to know</w:t>
+            </w:r>
+          </w:p>
+        </w:tc>
+      </w:tr>
+      <w:tr>
+        <w:tc>
+          <w:tcPr>
+            <w:tcW w:type="dxa" w:w="5112"/>
+            <w:shd w:val="clear" w:color="auto" w:fill="F1EEEF"/>
+          </w:tcPr>
+          <w:p>
+            <w:pPr>
+              <w:spacing w:after="40"/>
+            </w:pPr>
+            <w:r>
+              <w:rPr>
+                <w:b/>
+                <w:sz w:val="18"/>
+              </w:rPr>
+            </w:r>
+            <w:r>
+              <w:rPr>
+                <w:b/>
+                <w:i w:val="0"/>
+                <w:sz w:val="18"/>
+              </w:rPr>
+              <w:t>★ Troponin I</w:t>
+            </w:r>
+          </w:p>
+        </w:tc>
+        <w:tc>
+          <w:tcPr>
+            <w:tcW w:type="dxa" w:w="5112"/>
+          </w:tcPr>
+          <w:p>
+            <w:pPr>
+              <w:spacing w:after="40"/>
+            </w:pPr>
+            <w:r>
+              <w:rPr>
+                <w:sz w:val="18"/>
+              </w:rPr>
+            </w:r>
+            <w:r>
+              <w:rPr>
+                <w:b w:val="0"/>
+                <w:i w:val="0"/>
+                <w:sz w:val="18"/>
+              </w:rPr>
+              <w:t xml:space="preserve">Standard: </w:t>
+            </w:r>
+            <w:r>
+              <w:rPr>
+                <w:b/>
+                <w:i w:val="0"/>
+                <w:sz w:val="18"/>
+              </w:rPr>
+              <w:t>abnormal above 0.04 ng/mL</w:t>
+            </w:r>
+            <w:r>
+              <w:rPr>
+                <w:b w:val="0"/>
+                <w:i w:val="0"/>
+                <w:sz w:val="18"/>
+              </w:rPr>
+              <w:t xml:space="preserve">. High-sensitivity: </w:t>
+            </w:r>
+            <w:r>
+              <w:rPr>
+                <w:b/>
+                <w:i w:val="0"/>
+                <w:sz w:val="18"/>
+              </w:rPr>
+              <w:t>12 ng/L women, 20 ng/L men</w:t>
+            </w:r>
+            <w:r>
+              <w:rPr>
+                <w:b w:val="0"/>
+                <w:i w:val="0"/>
+                <w:sz w:val="18"/>
+              </w:rPr>
+              <w:t xml:space="preserve"> (99th percentile). </w:t>
+            </w:r>
+            <w:r>
+              <w:rPr>
+                <w:b/>
+                <w:i w:val="0"/>
+                <w:sz w:val="18"/>
+              </w:rPr>
+              <w:t>Rules OUT</w:t>
+            </w:r>
+            <w:r>
+              <w:rPr>
+                <w:b w:val="0"/>
+                <w:i w:val="0"/>
+                <w:sz w:val="18"/>
+              </w:rPr>
+              <w:t xml:space="preserve"> (who can go home); </w:t>
+            </w:r>
+            <w:r>
+              <w:rPr>
+                <w:b/>
+                <w:i w:val="0"/>
+                <w:sz w:val="18"/>
+              </w:rPr>
+              <w:t>one means two</w:t>
+            </w:r>
+            <w:r>
+              <w:rPr>
+                <w:b w:val="0"/>
+                <w:i w:val="0"/>
+                <w:sz w:val="18"/>
+              </w:rPr>
+              <w:t xml:space="preserve"> (repeat, watch for a rise). Troponin I is heart-specific; smooth muscle has none.</w:t>
+            </w:r>
+          </w:p>
+        </w:tc>
+      </w:tr>
+      <w:tr>
+        <w:tc>
+          <w:tcPr>
+            <w:tcW w:type="dxa" w:w="5112"/>
+            <w:shd w:val="clear" w:color="auto" w:fill="F1EEEF"/>
+          </w:tcPr>
+          <w:p>
+            <w:pPr>
+              <w:spacing w:after="40"/>
+            </w:pPr>
+            <w:r>
+              <w:rPr>
+                <w:b/>
+                <w:sz w:val="18"/>
+              </w:rPr>
+            </w:r>
+            <w:r>
+              <w:rPr>
+                <w:b/>
+                <w:i w:val="0"/>
+                <w:sz w:val="18"/>
+              </w:rPr>
+              <w:t>Stable angina</w:t>
+            </w:r>
+          </w:p>
+        </w:tc>
+        <w:tc>
+          <w:tcPr>
+            <w:tcW w:type="dxa" w:w="5112"/>
+          </w:tcPr>
+          <w:p>
+            <w:pPr>
+              <w:spacing w:after="40"/>
+            </w:pPr>
+            <w:r>
+              <w:rPr>
+                <w:sz w:val="18"/>
+              </w:rPr>
+            </w:r>
+            <w:r>
+              <w:rPr>
+                <w:b w:val="0"/>
+                <w:i w:val="0"/>
+                <w:sz w:val="18"/>
+              </w:rPr>
+              <w:t xml:space="preserve">Most common; with exertion, relieved by rest + nitroglycerin. Stress-test T-wave inversion; </w:t>
+            </w:r>
+            <w:r>
+              <w:rPr>
+                <w:b/>
+                <w:i w:val="0"/>
+                <w:sz w:val="18"/>
+              </w:rPr>
+              <w:t>coronary angiography = gold standard</w:t>
+            </w:r>
+            <w:r>
+              <w:rPr>
+                <w:b w:val="0"/>
+                <w:i w:val="0"/>
+                <w:sz w:val="18"/>
+              </w:rPr>
+              <w:t xml:space="preserve">. Beta blocker (calcium channel blocker if contraindicated), statin, aspirin ± clopidogrel. </w:t>
+            </w:r>
+            <w:r>
+              <w:rPr>
+                <w:b/>
+                <w:i w:val="0"/>
+                <w:sz w:val="18"/>
+              </w:rPr>
+              <w:t>Call emergency medical services if unimproved 5 min after one dose or after 3 doses.</w:t>
+            </w:r>
+          </w:p>
+        </w:tc>
+      </w:tr>
+      <w:tr>
+        <w:tc>
+          <w:tcPr>
+            <w:tcW w:type="dxa" w:w="5112"/>
+            <w:shd w:val="clear" w:color="auto" w:fill="F1EEEF"/>
+          </w:tcPr>
+          <w:p>
+            <w:pPr>
+              <w:spacing w:after="40"/>
+            </w:pPr>
+            <w:r>
+              <w:rPr>
+                <w:b/>
+                <w:sz w:val="18"/>
+              </w:rPr>
+            </w:r>
+            <w:r>
+              <w:rPr>
+                <w:b/>
+                <w:i w:val="0"/>
+                <w:sz w:val="18"/>
+              </w:rPr>
+              <w:t>★ Unstable angina vs the infarcts</w:t>
+            </w:r>
+          </w:p>
+        </w:tc>
+        <w:tc>
+          <w:tcPr>
+            <w:tcW w:type="dxa" w:w="5112"/>
+          </w:tcPr>
+          <w:p>
+            <w:pPr>
+              <w:spacing w:after="40"/>
+            </w:pPr>
+            <w:r>
+              <w:rPr>
+                <w:sz w:val="18"/>
+              </w:rPr>
+            </w:r>
+            <w:r>
+              <w:rPr>
+                <w:b w:val="0"/>
+                <w:i w:val="0"/>
+                <w:sz w:val="18"/>
+              </w:rPr>
+              <w:t xml:space="preserve">Unstable angina: rest pain, inverted T waves, </w:t>
+            </w:r>
+            <w:r>
+              <w:rPr>
+                <w:b/>
+                <w:i w:val="0"/>
+                <w:sz w:val="18"/>
+              </w:rPr>
+              <w:t>troponin normal</w:t>
+            </w:r>
+            <w:r>
+              <w:rPr>
+                <w:b w:val="0"/>
+                <w:i w:val="0"/>
+                <w:sz w:val="18"/>
+              </w:rPr>
+              <w:t xml:space="preserve">. Non-ST-elevation infarction: </w:t>
+            </w:r>
+            <w:r>
+              <w:rPr>
+                <w:b/>
+                <w:i w:val="0"/>
+                <w:sz w:val="18"/>
+              </w:rPr>
+              <w:t>ST depression &gt;1 mm and/or T inversion</w:t>
+            </w:r>
+            <w:r>
+              <w:rPr>
+                <w:b w:val="0"/>
+                <w:i w:val="0"/>
+                <w:sz w:val="18"/>
+              </w:rPr>
+              <w:t xml:space="preserve"> in ≥2 consecutive leads + </w:t>
+            </w:r>
+            <w:r>
+              <w:rPr>
+                <w:b/>
+                <w:i w:val="0"/>
+                <w:sz w:val="18"/>
+              </w:rPr>
+              <w:t>troponin elevated</w:t>
+            </w:r>
+            <w:r>
+              <w:rPr>
+                <w:b w:val="0"/>
+                <w:i w:val="0"/>
+                <w:sz w:val="18"/>
+              </w:rPr>
+              <w:t xml:space="preserve">. ST-elevation: &gt;1 mm in ≥2 consecutive leads; </w:t>
+            </w:r>
+            <w:r>
+              <w:rPr>
+                <w:b/>
+                <w:i w:val="0"/>
+                <w:sz w:val="18"/>
+              </w:rPr>
+              <w:t>new left bundle branch block = equivalent</w:t>
+            </w:r>
+            <w:r>
+              <w:rPr>
+                <w:b w:val="0"/>
+                <w:i w:val="0"/>
+                <w:sz w:val="18"/>
+              </w:rPr>
+              <w:t>.</w:t>
+            </w:r>
+          </w:p>
+        </w:tc>
+      </w:tr>
+      <w:tr>
+        <w:tc>
+          <w:tcPr>
+            <w:tcW w:type="dxa" w:w="5112"/>
+            <w:shd w:val="clear" w:color="auto" w:fill="F1EEEF"/>
+          </w:tcPr>
+          <w:p>
+            <w:pPr>
+              <w:spacing w:after="40"/>
+            </w:pPr>
+            <w:r>
+              <w:rPr>
+                <w:b/>
+                <w:sz w:val="18"/>
+              </w:rPr>
+            </w:r>
+            <w:r>
+              <w:rPr>
+                <w:b/>
+                <w:i w:val="0"/>
+                <w:sz w:val="18"/>
+              </w:rPr>
+              <w:t>UA / NSTEMI treatment</w:t>
+            </w:r>
+          </w:p>
+        </w:tc>
+        <w:tc>
+          <w:tcPr>
+            <w:tcW w:type="dxa" w:w="5112"/>
+          </w:tcPr>
+          <w:p>
+            <w:pPr>
+              <w:spacing w:after="40"/>
+            </w:pPr>
+            <w:r>
+              <w:rPr>
+                <w:sz w:val="18"/>
+              </w:rPr>
+            </w:r>
+            <w:r>
+              <w:rPr>
+                <w:b w:val="0"/>
+                <w:i w:val="0"/>
+                <w:sz w:val="18"/>
+              </w:rPr>
+              <w:t xml:space="preserve">Medical emergency: chewable aspirin, beta blocker, intravenous nitrates, dual antiplatelet ± anticoagulation. </w:t>
+            </w:r>
+            <w:r>
+              <w:rPr>
+                <w:b/>
+                <w:i w:val="0"/>
+                <w:sz w:val="18"/>
+              </w:rPr>
+              <w:t>Oxygen only if SpO2 &lt;91%.</w:t>
+            </w:r>
+            <w:r>
+              <w:rPr>
+                <w:b w:val="0"/>
+                <w:i w:val="0"/>
+                <w:sz w:val="18"/>
+              </w:rPr>
+              <w:t xml:space="preserve"> Then catheterization and angiography.</w:t>
+            </w:r>
+          </w:p>
+        </w:tc>
+      </w:tr>
+      <w:tr>
+        <w:tc>
+          <w:tcPr>
+            <w:tcW w:type="dxa" w:w="5112"/>
+            <w:shd w:val="clear" w:color="auto" w:fill="F1EEEF"/>
+          </w:tcPr>
+          <w:p>
+            <w:pPr>
+              <w:spacing w:after="40"/>
+            </w:pPr>
+            <w:r>
+              <w:rPr>
+                <w:b/>
+                <w:sz w:val="18"/>
+              </w:rPr>
+            </w:r>
+            <w:r>
+              <w:rPr>
+                <w:b/>
+                <w:i w:val="0"/>
+                <w:sz w:val="18"/>
+              </w:rPr>
+              <w:t>★ Lead → artery</w:t>
+            </w:r>
+          </w:p>
+        </w:tc>
+        <w:tc>
+          <w:tcPr>
+            <w:tcW w:type="dxa" w:w="5112"/>
+          </w:tcPr>
+          <w:p>
+            <w:pPr>
+              <w:spacing w:after="40"/>
+            </w:pPr>
+            <w:r>
+              <w:rPr>
+                <w:sz w:val="18"/>
+              </w:rPr>
+            </w:r>
+            <w:r>
+              <w:rPr>
+                <w:b/>
+                <w:i w:val="0"/>
+                <w:sz w:val="18"/>
+              </w:rPr>
+              <w:t>II, III, aVF = inferior = right coronary</w:t>
+            </w:r>
+            <w:r>
+              <w:rPr>
+                <w:b w:val="0"/>
+                <w:i w:val="0"/>
+                <w:sz w:val="18"/>
+              </w:rPr>
+              <w:t xml:space="preserve"> · I, aVL, V5–V6 = lateral = circumflex · V1–V4 = anterior/septal = LAD (V4 is anterior). Subendocardial → ST depression; transmural → ST elevation. Q waves = infarct already done.</w:t>
+            </w:r>
+          </w:p>
+        </w:tc>
+      </w:tr>
+      <w:tr>
+        <w:tc>
+          <w:tcPr>
+            <w:tcW w:type="dxa" w:w="5112"/>
+            <w:shd w:val="clear" w:color="auto" w:fill="F1EEEF"/>
+          </w:tcPr>
+          <w:p>
+            <w:pPr>
+              <w:spacing w:after="40"/>
+            </w:pPr>
+            <w:r>
+              <w:rPr>
+                <w:b/>
+                <w:sz w:val="18"/>
+              </w:rPr>
+            </w:r>
+            <w:r>
+              <w:rPr>
+                <w:b/>
+                <w:i w:val="0"/>
+                <w:sz w:val="18"/>
+              </w:rPr>
+              <w:t>★ Posterior</w:t>
+            </w:r>
+          </w:p>
+        </w:tc>
+        <w:tc>
+          <w:tcPr>
+            <w:tcW w:type="dxa" w:w="5112"/>
+          </w:tcPr>
+          <w:p>
+            <w:pPr>
+              <w:spacing w:after="40"/>
+            </w:pPr>
+            <w:r>
+              <w:rPr>
+                <w:sz w:val="18"/>
+              </w:rPr>
+            </w:r>
+            <w:r>
+              <w:rPr>
+                <w:b/>
+                <w:i w:val="0"/>
+                <w:sz w:val="18"/>
+              </w:rPr>
+              <w:t>ST depression in V1–V3</w:t>
+            </w:r>
+            <w:r>
+              <w:rPr>
+                <w:b w:val="0"/>
+                <w:i w:val="0"/>
+                <w:sz w:val="18"/>
+              </w:rPr>
+              <w:t xml:space="preserve"> = posterior infarct (easy to miss) → record </w:t>
+            </w:r>
+            <w:r>
+              <w:rPr>
+                <w:b/>
+                <w:i w:val="0"/>
+                <w:sz w:val="18"/>
+              </w:rPr>
+              <w:t>posterior leads V7–V9</w:t>
+            </w:r>
+            <w:r>
+              <w:rPr>
+                <w:b w:val="0"/>
+                <w:i w:val="0"/>
+                <w:sz w:val="18"/>
+              </w:rPr>
+              <w:t>.</w:t>
+            </w:r>
+          </w:p>
+        </w:tc>
+      </w:tr>
+    </w:tbl>
+    <w:p>
+      <w:pPr>
+        <w:spacing w:after="80"/>
+      </w:pPr>
+    </w:p>
+    <w:p>
+      <w:pPr>
+        <w:pStyle w:val="Heading1"/>
+        <w:spacing w:before="280" w:after="100"/>
+      </w:pPr>
+      <w:r>
+        <w:rPr>
+          <w:rFonts w:ascii="Georgia" w:hAnsi="Georgia"/>
+          <w:color w:val="17494B"/>
+        </w:rPr>
+        <w:t>CAD: STEMI Care, Stents &amp; Variants</w:t>
+      </w:r>
+    </w:p>
+    <w:tbl>
+      <w:tblPr>
+        <w:tblStyle w:val="TableGrid"/>
+        <w:tblW w:type="auto" w:w="0"/>
+        <w:jc w:val="center"/>
+        <w:tblLook w:firstColumn="1" w:firstRow="1" w:lastColumn="0" w:lastRow="0" w:noHBand="0" w:noVBand="1" w:val="04A0"/>
+        <w:tblBorders>
+          <w:top w:val="single" w:sz="4" w:space="0" w:color="D8D2D4"/>
+          <w:left w:val="single" w:sz="4" w:space="0" w:color="D8D2D4"/>
+          <w:bottom w:val="single" w:sz="4" w:space="0" w:color="D8D2D4"/>
+          <w:right w:val="single" w:sz="4" w:space="0" w:color="D8D2D4"/>
+          <w:insideH w:val="single" w:sz="4" w:space="0" w:color="D8D2D4"/>
+          <w:insideV w:val="single" w:sz="4" w:space="0" w:color="D8D2D4"/>
+        </w:tblBorders>
+      </w:tblPr>
+      <w:tblGrid>
+        <w:gridCol w:w="5112"/>
+        <w:gridCol w:w="5112"/>
+      </w:tblGrid>
+      <w:tr>
+        <w:tc>
+          <w:tcPr>
+            <w:tcW w:type="dxa" w:w="5112"/>
+            <w:shd w:val="clear" w:color="auto" w:fill="17494B"/>
+          </w:tcPr>
+          <w:p>
+            <w:pPr>
+              <w:spacing w:after="40"/>
+            </w:pPr>
+            <w:r>
+              <w:rPr>
+                <w:b/>
+                <w:color w:val="FFFFFF"/>
+                <w:sz w:val="18"/>
+              </w:rPr>
+            </w:r>
+            <w:r>
+              <w:rPr>
+                <w:b/>
+                <w:i w:val="0"/>
+                <w:color w:val="FFFFFF"/>
+                <w:sz w:val="18"/>
+              </w:rPr>
+              <w:t>Term</w:t>
+            </w:r>
+          </w:p>
+        </w:tc>
+        <w:tc>
+          <w:tcPr>
+            <w:tcW w:type="dxa" w:w="5112"/>
+            <w:shd w:val="clear" w:color="auto" w:fill="17494B"/>
+          </w:tcPr>
+          <w:p>
+            <w:pPr>
+              <w:spacing w:after="40"/>
+            </w:pPr>
+            <w:r>
+              <w:rPr>
+                <w:b/>
+                <w:color w:val="FFFFFF"/>
+                <w:sz w:val="18"/>
+              </w:rPr>
+            </w:r>
+            <w:r>
+              <w:rPr>
+                <w:b/>
+                <w:i w:val="0"/>
+                <w:color w:val="FFFFFF"/>
+                <w:sz w:val="18"/>
+              </w:rPr>
+              <w:t>What you need to know</w:t>
+            </w:r>
+          </w:p>
+        </w:tc>
+      </w:tr>
+      <w:tr>
+        <w:tc>
+          <w:tcPr>
+            <w:tcW w:type="dxa" w:w="5112"/>
+            <w:shd w:val="clear" w:color="auto" w:fill="F1EEEF"/>
+          </w:tcPr>
+          <w:p>
+            <w:pPr>
+              <w:spacing w:after="40"/>
+            </w:pPr>
+            <w:r>
+              <w:rPr>
+                <w:b/>
+                <w:sz w:val="18"/>
+              </w:rPr>
+            </w:r>
+            <w:r>
+              <w:rPr>
+                <w:b/>
+                <w:i w:val="0"/>
+                <w:sz w:val="18"/>
+              </w:rPr>
+              <w:t>★ Time is muscle</w:t>
+            </w:r>
+          </w:p>
+        </w:tc>
+        <w:tc>
+          <w:tcPr>
+            <w:tcW w:type="dxa" w:w="5112"/>
+          </w:tcPr>
+          <w:p>
+            <w:pPr>
+              <w:spacing w:after="40"/>
+            </w:pPr>
+            <w:r>
+              <w:rPr>
+                <w:sz w:val="18"/>
+              </w:rPr>
+            </w:r>
+            <w:r>
+              <w:rPr>
+                <w:b w:val="0"/>
+                <w:i w:val="0"/>
+                <w:sz w:val="18"/>
+              </w:rPr>
+              <w:t xml:space="preserve">Electrocardiogram </w:t>
+            </w:r>
+            <w:r>
+              <w:rPr>
+                <w:b/>
+                <w:i w:val="0"/>
+                <w:sz w:val="18"/>
+              </w:rPr>
+              <w:t>within 10 min</w:t>
+            </w:r>
+            <w:r>
+              <w:rPr>
+                <w:b w:val="0"/>
+                <w:i w:val="0"/>
+                <w:sz w:val="18"/>
+              </w:rPr>
+              <w:t xml:space="preserve">; door-to-balloon </w:t>
+            </w:r>
+            <w:r>
+              <w:rPr>
+                <w:b/>
+                <w:i w:val="0"/>
+                <w:sz w:val="18"/>
+              </w:rPr>
+              <w:t>&lt;90 min</w:t>
+            </w:r>
+            <w:r>
+              <w:rPr>
+                <w:b w:val="0"/>
+                <w:i w:val="0"/>
+                <w:sz w:val="18"/>
+              </w:rPr>
+              <w:t xml:space="preserve">. Chewable aspirin, call the catheterization team, then P2Y12 antagonist + heparin; beta blocker if no bradycardia. </w:t>
+            </w:r>
+            <w:r>
+              <w:rPr>
+                <w:b/>
+                <w:i w:val="0"/>
+                <w:sz w:val="18"/>
+              </w:rPr>
+              <w:t>Thrombolytics if intervention is 2+ hours away</w:t>
+            </w:r>
+            <w:r>
+              <w:rPr>
+                <w:b w:val="0"/>
+                <w:i w:val="0"/>
+                <w:sz w:val="18"/>
+              </w:rPr>
+              <w:t>, within 30 min of arrival; tenecteplase most common.</w:t>
+            </w:r>
+          </w:p>
+        </w:tc>
+      </w:tr>
+      <w:tr>
+        <w:tc>
+          <w:tcPr>
+            <w:tcW w:type="dxa" w:w="5112"/>
+            <w:shd w:val="clear" w:color="auto" w:fill="F1EEEF"/>
+          </w:tcPr>
+          <w:p>
+            <w:pPr>
+              <w:spacing w:after="40"/>
+            </w:pPr>
+            <w:r>
+              <w:rPr>
+                <w:b/>
+                <w:sz w:val="18"/>
+              </w:rPr>
+            </w:r>
+            <w:r>
+              <w:rPr>
+                <w:b/>
+                <w:i w:val="0"/>
+                <w:sz w:val="18"/>
+              </w:rPr>
+              <w:t>★ Right ventricular infarct</w:t>
+            </w:r>
+          </w:p>
+        </w:tc>
+        <w:tc>
+          <w:tcPr>
+            <w:tcW w:type="dxa" w:w="5112"/>
+          </w:tcPr>
+          <w:p>
+            <w:pPr>
+              <w:spacing w:after="40"/>
+            </w:pPr>
+            <w:r>
+              <w:rPr>
+                <w:sz w:val="18"/>
+              </w:rPr>
+            </w:r>
+            <w:r>
+              <w:rPr>
+                <w:b w:val="0"/>
+                <w:i w:val="0"/>
+                <w:sz w:val="18"/>
+              </w:rPr>
+              <w:t xml:space="preserve">Right coronary occlusion reaching the right ventricle (15–30%; ST elevation V1, V4R): </w:t>
+            </w:r>
+            <w:r>
+              <w:rPr>
+                <w:b/>
+                <w:i w:val="0"/>
+                <w:sz w:val="18"/>
+              </w:rPr>
+              <w:t>NO nitroglycerin</w:t>
+            </w:r>
+            <w:r>
+              <w:rPr>
+                <w:b w:val="0"/>
+                <w:i w:val="0"/>
+                <w:sz w:val="18"/>
+              </w:rPr>
+              <w:t xml:space="preserve"> — preload falls, shock. Also no nitroglycerin within 24 h of a phosphodiesterase inhibitor (ask women: pulmonary arterial hypertension).</w:t>
+            </w:r>
+          </w:p>
+        </w:tc>
+      </w:tr>
+      <w:tr>
+        <w:tc>
+          <w:tcPr>
+            <w:tcW w:type="dxa" w:w="5112"/>
+            <w:shd w:val="clear" w:color="auto" w:fill="F1EEEF"/>
+          </w:tcPr>
+          <w:p>
+            <w:pPr>
+              <w:spacing w:after="40"/>
+            </w:pPr>
+            <w:r>
+              <w:rPr>
+                <w:b/>
+                <w:sz w:val="18"/>
+              </w:rPr>
+            </w:r>
+            <w:r>
+              <w:rPr>
+                <w:b/>
+                <w:i w:val="0"/>
+                <w:sz w:val="18"/>
+              </w:rPr>
+              <w:t>Thrombolytic contraindications</w:t>
+            </w:r>
+          </w:p>
+        </w:tc>
+        <w:tc>
+          <w:tcPr>
+            <w:tcW w:type="dxa" w:w="5112"/>
+          </w:tcPr>
+          <w:p>
+            <w:pPr>
+              <w:spacing w:after="40"/>
+            </w:pPr>
+            <w:r>
+              <w:rPr>
+                <w:sz w:val="18"/>
+              </w:rPr>
+            </w:r>
+            <w:r>
+              <w:rPr>
+                <w:b w:val="0"/>
+                <w:i w:val="0"/>
+                <w:sz w:val="18"/>
+              </w:rPr>
+              <w:t>Absolute: active bleeding, major surgery/trauma 4 weeks, hemorrhagic stroke in the previous year, unknown stroke 6 weeks, pregnancy, uncontrolled &gt;190/100.</w:t>
+            </w:r>
+          </w:p>
+        </w:tc>
+      </w:tr>
+      <w:tr>
+        <w:tc>
+          <w:tcPr>
+            <w:tcW w:type="dxa" w:w="5112"/>
+            <w:shd w:val="clear" w:color="auto" w:fill="F1EEEF"/>
+          </w:tcPr>
+          <w:p>
+            <w:pPr>
+              <w:spacing w:after="40"/>
+            </w:pPr>
+            <w:r>
+              <w:rPr>
+                <w:b/>
+                <w:sz w:val="18"/>
+              </w:rPr>
+            </w:r>
+            <w:r>
+              <w:rPr>
+                <w:b/>
+                <w:i w:val="0"/>
+                <w:sz w:val="18"/>
+              </w:rPr>
+              <w:t>★ Words have meaning</w:t>
+            </w:r>
+          </w:p>
+        </w:tc>
+        <w:tc>
+          <w:tcPr>
+            <w:tcW w:type="dxa" w:w="5112"/>
+          </w:tcPr>
+          <w:p>
+            <w:pPr>
+              <w:spacing w:after="40"/>
+            </w:pPr>
+            <w:r>
+              <w:rPr>
+                <w:sz w:val="18"/>
+              </w:rPr>
+            </w:r>
+            <w:r>
+              <w:rPr>
+                <w:b w:val="0"/>
+                <w:i w:val="0"/>
+                <w:sz w:val="18"/>
+              </w:rPr>
+              <w:t xml:space="preserve">Catheterization = the tube in; </w:t>
+            </w:r>
+            <w:r>
+              <w:rPr>
+                <w:b/>
+                <w:i w:val="0"/>
+                <w:sz w:val="18"/>
+              </w:rPr>
+              <w:t>angiography = dye + pictures</w:t>
+            </w:r>
+            <w:r>
+              <w:rPr>
+                <w:b w:val="0"/>
+                <w:i w:val="0"/>
+                <w:sz w:val="18"/>
+              </w:rPr>
+              <w:t xml:space="preserve">; plain old balloon angioplasty = no stent; </w:t>
+            </w:r>
+            <w:r>
+              <w:rPr>
+                <w:b/>
+                <w:i w:val="0"/>
+                <w:sz w:val="18"/>
+              </w:rPr>
+              <w:t>percutaneous coronary intervention = stent</w:t>
+            </w:r>
+            <w:r>
+              <w:rPr>
+                <w:b w:val="0"/>
+                <w:i w:val="0"/>
+                <w:sz w:val="18"/>
+              </w:rPr>
+              <w:t xml:space="preserve">. </w:t>
+            </w:r>
+            <w:r>
+              <w:rPr>
+                <w:b/>
+                <w:i w:val="0"/>
+                <w:sz w:val="18"/>
+              </w:rPr>
+              <w:t>Missing dual antiplatelet therapy in the first 6 weeks = 50% sudden in-stent restenosis.</w:t>
+            </w:r>
+            <w:r>
+              <w:rPr>
+                <w:b w:val="0"/>
+                <w:i w:val="0"/>
+                <w:sz w:val="18"/>
+              </w:rPr>
+              <w:t xml:space="preserve"> Bypass: mammary/radial </w:t>
+            </w:r>
+            <w:r>
+              <w:rPr>
+                <w:b/>
+                <w:i w:val="0"/>
+                <w:sz w:val="18"/>
+              </w:rPr>
+              <w:t>artery first</w:t>
+            </w:r>
+            <w:r>
+              <w:rPr>
+                <w:b w:val="0"/>
+                <w:i w:val="0"/>
+                <w:sz w:val="18"/>
+              </w:rPr>
+              <w:t>, saphenous vein if not.</w:t>
+            </w:r>
+          </w:p>
+        </w:tc>
+      </w:tr>
+      <w:tr>
+        <w:tc>
+          <w:tcPr>
+            <w:tcW w:type="dxa" w:w="5112"/>
+            <w:shd w:val="clear" w:color="auto" w:fill="F1EEEF"/>
+          </w:tcPr>
+          <w:p>
+            <w:pPr>
+              <w:spacing w:after="40"/>
+            </w:pPr>
+            <w:r>
+              <w:rPr>
+                <w:b/>
+                <w:sz w:val="18"/>
+              </w:rPr>
+            </w:r>
+            <w:r>
+              <w:rPr>
+                <w:b/>
+                <w:i w:val="0"/>
+                <w:sz w:val="18"/>
+              </w:rPr>
+              <w:t>★ After the infarct</w:t>
+            </w:r>
+          </w:p>
+        </w:tc>
+        <w:tc>
+          <w:tcPr>
+            <w:tcW w:type="dxa" w:w="5112"/>
+          </w:tcPr>
+          <w:p>
+            <w:pPr>
+              <w:spacing w:after="40"/>
+            </w:pPr>
+            <w:r>
+              <w:rPr>
+                <w:sz w:val="18"/>
+              </w:rPr>
+            </w:r>
+            <w:r>
+              <w:rPr>
+                <w:b/>
+                <w:i w:val="0"/>
+                <w:sz w:val="18"/>
+              </w:rPr>
+              <w:t>Beta blockers improve survival; calcium channel blockers do not</w:t>
+            </w:r>
+            <w:r>
+              <w:rPr>
+                <w:b w:val="0"/>
+                <w:i w:val="0"/>
+                <w:sz w:val="18"/>
+              </w:rPr>
+              <w:t xml:space="preserve"> (diltiazem/verapamil only with preserved function). High-intensity statin for every acute coronary syndrome before discharge; ACE (angiotensin-converting enzyme) inhibitor if reduced function; warfarin for large anterior infarcts. Dressler = pericarditis; cardiogenic shock more with left-sided.</w:t>
+            </w:r>
+          </w:p>
+        </w:tc>
+      </w:tr>
+      <w:tr>
+        <w:tc>
+          <w:tcPr>
+            <w:tcW w:type="dxa" w:w="5112"/>
+            <w:shd w:val="clear" w:color="auto" w:fill="F1EEEF"/>
+          </w:tcPr>
+          <w:p>
+            <w:pPr>
+              <w:spacing w:after="40"/>
+            </w:pPr>
+            <w:r>
+              <w:rPr>
+                <w:b/>
+                <w:sz w:val="18"/>
+              </w:rPr>
+            </w:r>
+            <w:r>
+              <w:rPr>
+                <w:b/>
+                <w:i w:val="0"/>
+                <w:sz w:val="18"/>
+              </w:rPr>
+              <w:t>★ Sudden cardiac death</w:t>
+            </w:r>
+          </w:p>
+        </w:tc>
+        <w:tc>
+          <w:tcPr>
+            <w:tcW w:type="dxa" w:w="5112"/>
+          </w:tcPr>
+          <w:p>
+            <w:pPr>
+              <w:spacing w:after="40"/>
+            </w:pPr>
+            <w:r>
+              <w:rPr>
+                <w:sz w:val="18"/>
+              </w:rPr>
+            </w:r>
+            <w:r>
+              <w:rPr>
+                <w:b w:val="0"/>
+                <w:i w:val="0"/>
+                <w:sz w:val="18"/>
+              </w:rPr>
+              <w:t xml:space="preserve">Most often </w:t>
+            </w:r>
+            <w:r>
+              <w:rPr>
+                <w:b/>
+                <w:i w:val="0"/>
+                <w:sz w:val="18"/>
+              </w:rPr>
+              <w:t>ventricular fibrillation</w:t>
+            </w:r>
+            <w:r>
+              <w:rPr>
+                <w:b w:val="0"/>
+                <w:i w:val="0"/>
+                <w:sz w:val="18"/>
+              </w:rPr>
+              <w:t xml:space="preserve">; the first sign of coronary disease in </w:t>
+            </w:r>
+            <w:r>
+              <w:rPr>
+                <w:b/>
+                <w:i w:val="0"/>
+                <w:sz w:val="18"/>
+              </w:rPr>
+              <w:t>over 20%</w:t>
+            </w:r>
+            <w:r>
+              <w:rPr>
+                <w:b w:val="0"/>
+                <w:i w:val="0"/>
+                <w:sz w:val="18"/>
+              </w:rPr>
+              <w:t>.</w:t>
+            </w:r>
+          </w:p>
+        </w:tc>
+      </w:tr>
+      <w:tr>
+        <w:tc>
+          <w:tcPr>
+            <w:tcW w:type="dxa" w:w="5112"/>
+            <w:shd w:val="clear" w:color="auto" w:fill="F1EEEF"/>
+          </w:tcPr>
+          <w:p>
+            <w:pPr>
+              <w:spacing w:after="40"/>
+            </w:pPr>
+            <w:r>
+              <w:rPr>
+                <w:b/>
+                <w:sz w:val="18"/>
+              </w:rPr>
+            </w:r>
+            <w:r>
+              <w:rPr>
+                <w:b/>
+                <w:i w:val="0"/>
+                <w:sz w:val="18"/>
+              </w:rPr>
+              <w:t>★ Vasospastic (Prinzmetal)</w:t>
+            </w:r>
+          </w:p>
+        </w:tc>
+        <w:tc>
+          <w:tcPr>
+            <w:tcW w:type="dxa" w:w="5112"/>
+          </w:tcPr>
+          <w:p>
+            <w:pPr>
+              <w:spacing w:after="40"/>
+            </w:pPr>
+            <w:r>
+              <w:rPr>
+                <w:sz w:val="18"/>
+              </w:rPr>
+            </w:r>
+            <w:r>
+              <w:rPr>
+                <w:b w:val="0"/>
+                <w:i w:val="0"/>
+                <w:sz w:val="18"/>
+              </w:rPr>
+              <w:t xml:space="preserve">Often &lt;50, smoker, </w:t>
+            </w:r>
+            <w:r>
+              <w:rPr>
+                <w:b/>
+                <w:i w:val="0"/>
+                <w:sz w:val="18"/>
+              </w:rPr>
+              <w:t>rest pain midnight–8 a.m.</w:t>
+            </w:r>
+            <w:r>
+              <w:rPr>
+                <w:b w:val="0"/>
+                <w:i w:val="0"/>
+                <w:sz w:val="18"/>
+              </w:rPr>
+              <w:t xml:space="preserve">, 5–15 min, transient ST elevation, normal coronaries. </w:t>
+            </w:r>
+            <w:r>
+              <w:rPr>
+                <w:b/>
+                <w:i w:val="0"/>
+                <w:sz w:val="18"/>
+              </w:rPr>
+              <w:t>Gold standard: ergonovine/acetylcholine at angiography</w:t>
+            </w:r>
+            <w:r>
+              <w:rPr>
+                <w:b w:val="0"/>
+                <w:i w:val="0"/>
+                <w:sz w:val="18"/>
+              </w:rPr>
+              <w:t xml:space="preserve">, relieved by nitroglycerin. </w:t>
+            </w:r>
+            <w:r>
+              <w:rPr>
+                <w:b/>
+                <w:i w:val="0"/>
+                <w:sz w:val="18"/>
+              </w:rPr>
+              <w:t>Calcium channel blocker first-line</w:t>
+            </w:r>
+            <w:r>
+              <w:rPr>
+                <w:b w:val="0"/>
+                <w:i w:val="0"/>
+                <w:sz w:val="18"/>
+              </w:rPr>
+              <w:t xml:space="preserve">; avoid </w:t>
+            </w:r>
+            <w:r>
+              <w:rPr>
+                <w:b/>
+                <w:i w:val="0"/>
+                <w:sz w:val="18"/>
+              </w:rPr>
+              <w:t>nonselective</w:t>
+            </w:r>
+            <w:r>
+              <w:rPr>
+                <w:b w:val="0"/>
+                <w:i w:val="0"/>
+                <w:sz w:val="18"/>
+              </w:rPr>
+              <w:t xml:space="preserve"> beta blockers, aspirin, triptans.</w:t>
+            </w:r>
+          </w:p>
+        </w:tc>
+      </w:tr>
+      <w:tr>
+        <w:tc>
+          <w:tcPr>
+            <w:tcW w:type="dxa" w:w="5112"/>
+            <w:shd w:val="clear" w:color="auto" w:fill="F1EEEF"/>
+          </w:tcPr>
+          <w:p>
+            <w:pPr>
+              <w:spacing w:after="40"/>
+            </w:pPr>
+            <w:r>
+              <w:rPr>
+                <w:b/>
+                <w:sz w:val="18"/>
+              </w:rPr>
+            </w:r>
+            <w:r>
+              <w:rPr>
+                <w:b/>
+                <w:i w:val="0"/>
+                <w:sz w:val="18"/>
+              </w:rPr>
+              <w:t>Microvascular angina</w:t>
+            </w:r>
+          </w:p>
+        </w:tc>
+        <w:tc>
+          <w:tcPr>
+            <w:tcW w:type="dxa" w:w="5112"/>
+          </w:tcPr>
+          <w:p>
+            <w:pPr>
+              <w:spacing w:after="40"/>
+            </w:pPr>
+            <w:r>
+              <w:rPr>
+                <w:sz w:val="18"/>
+              </w:rPr>
+            </w:r>
+            <w:r>
+              <w:rPr>
+                <w:b w:val="0"/>
+                <w:i w:val="0"/>
+                <w:sz w:val="18"/>
+              </w:rPr>
+              <w:t xml:space="preserve">Formerly cardiac syndrome X: angina + ST changes, </w:t>
+            </w:r>
+            <w:r>
+              <w:rPr>
+                <w:b/>
+                <w:i w:val="0"/>
+                <w:sz w:val="18"/>
+              </w:rPr>
+              <w:t>normal coronaries</w:t>
+            </w:r>
+            <w:r>
+              <w:rPr>
+                <w:b w:val="0"/>
+                <w:i w:val="0"/>
+                <w:sz w:val="18"/>
+              </w:rPr>
+              <w:t>, women, stress; diagnosis of exclusion (needs angiography); treated like coronary disease.</w:t>
             </w:r>
           </w:p>
         </w:tc>

</xml_diff>

<commit_message>
CMS I Exam 4 L22/L25 guide and cram: settle the "slide wins" notes on the true value
Wording-only truth notes, nothing keyed changes:
- L22 risk-assessment trigger: slide 22 says ">2", slide 28 "2 or more";
  ATP III's trigger is 2 or more (slide 28).
- L22 pediatric second lipid screen: slides give 17-19 and 17-21; the 2018
  cholesterol guideline (the tested one) says 17-21.
- L22 saturated fat: <7% is kept as the course's therapeutic-lifestyle
  figure (a convention, not a conflict); Carter's spoken 10% is described as
  the looser Dietary Guidelines limit rather than "the slide wins".
- L25 slips (asymptomatic LVH = stage B; ICD needs life expectancy >= 1
  year): "the slide wins" -> "the slide is right, and matches 2022".

Co-Authored-By: Claude Opus 5.5 (1M context) <noreply@anthropic.com>
</commit_message>
<xml_diff>
--- a/Clinical Medicine and Surgery I Exam 4/cms-exam-4-cram-sheet.docx
+++ b/Clinical Medicine and Surgery I Exam 4/cms-exam-4-cram-sheet.docx
@@ -8062,7 +8062,7 @@
                 <w:i w:val="0"/>
                 <w:sz w:val="18"/>
               </w:rPr>
-              <w:t xml:space="preserve"> (slide wins over the spoken 10%), soluble fiber 20–30 g, plant stanols, lose 5–10%, 30 minutes activity, stop smoking. </w:t>
+              <w:t xml:space="preserve"> (the course figure; his spoken 10% is the looser Dietary Guidelines limit), soluble fiber 20–30 g, plant stanols, lose 5–10%, 30 minutes activity, stop smoking. </w:t>
             </w:r>
             <w:r>
               <w:rPr>
@@ -13586,7 +13586,7 @@
                 <w:i w:val="0"/>
                 <w:sz w:val="18"/>
               </w:rPr>
-              <w:t xml:space="preserve"> (the slide wins over the spoken “under a year”). After an acute event with fraction &lt;35%: wearable vest → optimize + rehab → recheck echo.</w:t>
+              <w:t xml:space="preserve"> (the slide is right; he said “under a year”). After an acute event with fraction &lt;35%: wearable vest → optimize + rehab → recheck echo.</w:t>
             </w:r>
           </w:p>
         </w:tc>

</xml_diff>